<commit_message>
created sub-registers in the i2c slave. This enables the possibility to have multiple 8 bit receive registers for control of pins
</commit_message>
<xml_diff>
--- a/EvalBoard/Notes/Eval Board Lattice LC4256ZE.docx
+++ b/EvalBoard/Notes/Eval Board Lattice LC4256ZE.docx
@@ -3,8 +3,21 @@
 <w:document xmlns:wpc="http://schemas.microsoft.com/office/word/2010/wordprocessingCanvas" xmlns:cx="http://schemas.microsoft.com/office/drawing/2014/chartex" xmlns:cx1="http://schemas.microsoft.com/office/drawing/2015/9/8/chartex" xmlns:cx2="http://schemas.microsoft.com/office/drawing/2015/10/21/chartex" xmlns:cx3="http://schemas.microsoft.com/office/drawing/2016/5/9/chartex" xmlns:cx4="http://schemas.microsoft.com/office/drawing/2016/5/10/chartex" xmlns:cx5="http://schemas.microsoft.com/office/drawing/2016/5/11/chartex" xmlns:cx6="http://schemas.microsoft.com/office/drawing/2016/5/12/chartex" xmlns:cx7="http://schemas.microsoft.com/office/drawing/2016/5/13/chartex" xmlns:cx8="http://schemas.microsoft.com/office/drawing/2016/5/14/chartex" xmlns:mc="http://schemas.openxmlformats.org/markup-compatibility/2006" xmlns:aink="http://schemas.microsoft.com/office/drawing/2016/ink" xmlns:am3d="http://schemas.microsoft.com/office/drawing/2017/model3d" xmlns:o="urn:schemas-microsoft-com:office:office" xmlns:r="http://schemas.openxmlformats.org/officeDocument/2006/relationships" xmlns:m="http://schemas.openxmlformats.org/officeDocument/2006/math" xmlns:v="urn:schemas-microsoft-com:vml" xmlns:wp14="http://schemas.microsoft.com/office/word/2010/wordprocessingDrawing" xmlns:wp="http://schemas.openxmlformats.org/drawingml/2006/wordprocessingDrawing" xmlns:w10="urn:schemas-microsoft-com:office:word" xmlns:w="http://schemas.openxmlformats.org/wordprocessingml/2006/main" xmlns:w14="http://schemas.microsoft.com/office/word/2010/wordml" xmlns:w15="http://schemas.microsoft.com/office/word/2012/wordml" xmlns:w16cex="http://schemas.microsoft.com/office/word/2018/wordml/cex" xmlns:w16cid="http://schemas.microsoft.com/office/word/2016/wordml/cid" xmlns:w16="http://schemas.microsoft.com/office/word/2018/wordml" xmlns:w16sdtdh="http://schemas.microsoft.com/office/word/2020/wordml/sdtdatahash" xmlns:w16se="http://schemas.microsoft.com/office/word/2015/wordml/symex" xmlns:wpg="http://schemas.microsoft.com/office/word/2010/wordprocessingGroup" xmlns:wpi="http://schemas.microsoft.com/office/word/2010/wordprocessingInk" xmlns:wne="http://schemas.microsoft.com/office/word/2006/wordml" xmlns:wps="http://schemas.microsoft.com/office/word/2010/wordprocessingShape" mc:Ignorable="w14 w15 w16se w16cid w16 w16cex w16sdtdh wp14">
   <w:body>
     <w:p>
-      <w:r>
-        <w:t>Eval Board Lattice LC4256ZE</w:t>
+      <w:proofErr w:type="spellStart"/>
+      <w:r>
+        <w:t>Eval</w:t>
+      </w:r>
+      <w:proofErr w:type="spellEnd"/>
+      <w:r>
+        <w:t xml:space="preserve"> Board </w:t>
+      </w:r>
+      <w:proofErr w:type="spellStart"/>
+      <w:r>
+        <w:t>Lattice</w:t>
+      </w:r>
+      <w:proofErr w:type="spellEnd"/>
+      <w:r>
+        <w:t xml:space="preserve"> LC4256ZE</w:t>
       </w:r>
     </w:p>
     <w:p/>
@@ -114,17 +127,86 @@
     </w:p>
     <w:p/>
     <w:p>
-      <w:r>
-        <w:t>Conncet BUS signals in schematic editor:</w:t>
+      <w:proofErr w:type="spellStart"/>
+      <w:r>
+        <w:t>Conncet</w:t>
+      </w:r>
+      <w:proofErr w:type="spellEnd"/>
+      <w:r>
+        <w:t xml:space="preserve"> BUS </w:t>
+      </w:r>
+      <w:proofErr w:type="spellStart"/>
+      <w:r>
+        <w:t>signals</w:t>
+      </w:r>
+      <w:proofErr w:type="spellEnd"/>
+      <w:r>
+        <w:t xml:space="preserve"> in </w:t>
+      </w:r>
+      <w:proofErr w:type="spellStart"/>
+      <w:r>
+        <w:t>schematic</w:t>
+      </w:r>
+      <w:proofErr w:type="spellEnd"/>
+      <w:r>
+        <w:t xml:space="preserve"> </w:t>
+      </w:r>
+      <w:proofErr w:type="spellStart"/>
+      <w:r>
+        <w:t>editor</w:t>
+      </w:r>
+      <w:proofErr w:type="spellEnd"/>
+      <w:r>
+        <w:t>:</w:t>
       </w:r>
     </w:p>
     <w:p>
-      <w:r>
-        <w:t>Simply connecting them won’t work:</w:t>
+      <w:proofErr w:type="spellStart"/>
+      <w:r>
+        <w:t>Simply</w:t>
+      </w:r>
+      <w:proofErr w:type="spellEnd"/>
+      <w:r>
+        <w:t xml:space="preserve"> </w:t>
+      </w:r>
+      <w:proofErr w:type="spellStart"/>
+      <w:r>
+        <w:t>connecting</w:t>
+      </w:r>
+      <w:proofErr w:type="spellEnd"/>
+      <w:r>
+        <w:t xml:space="preserve"> </w:t>
+      </w:r>
+      <w:proofErr w:type="spellStart"/>
+      <w:r>
+        <w:t>them</w:t>
+      </w:r>
+      <w:proofErr w:type="spellEnd"/>
+      <w:r>
+        <w:t xml:space="preserve"> </w:t>
+      </w:r>
+      <w:proofErr w:type="spellStart"/>
+      <w:r>
+        <w:t>won’t</w:t>
+      </w:r>
+      <w:proofErr w:type="spellEnd"/>
+      <w:r>
+        <w:t xml:space="preserve"> </w:t>
+      </w:r>
+      <w:proofErr w:type="spellStart"/>
+      <w:r>
+        <w:t>work</w:t>
+      </w:r>
+      <w:proofErr w:type="spellEnd"/>
+      <w:r>
+        <w:t>:</w:t>
       </w:r>
     </w:p>
     <w:p>
       <w:r>
+        <w:rPr>
+          <w:noProof/>
+        </w:rPr>
         <w:lastRenderedPageBreak/>
         <w:drawing>
           <wp:inline distT="0" distB="0" distL="0" distR="0" wp14:anchorId="1DDE7E42" wp14:editId="7B9E7607">
@@ -165,12 +247,108 @@
     </w:p>
     <w:p/>
     <w:p>
-      <w:r>
-        <w:t>You have to add a NET name that includes the size of the bus:</w:t>
+      <w:proofErr w:type="spellStart"/>
+      <w:r>
+        <w:t>You</w:t>
+      </w:r>
+      <w:proofErr w:type="spellEnd"/>
+      <w:r>
+        <w:t xml:space="preserve"> </w:t>
+      </w:r>
+      <w:proofErr w:type="spellStart"/>
+      <w:r>
+        <w:t>have</w:t>
+      </w:r>
+      <w:proofErr w:type="spellEnd"/>
+      <w:r>
+        <w:t xml:space="preserve"> </w:t>
+      </w:r>
+      <w:proofErr w:type="spellStart"/>
+      <w:r>
+        <w:t>to</w:t>
+      </w:r>
+      <w:proofErr w:type="spellEnd"/>
+      <w:r>
+        <w:t xml:space="preserve"> </w:t>
+      </w:r>
+      <w:proofErr w:type="spellStart"/>
+      <w:r>
+        <w:t>add</w:t>
+      </w:r>
+      <w:proofErr w:type="spellEnd"/>
+      <w:r>
+        <w:t xml:space="preserve"> a NET </w:t>
+      </w:r>
+      <w:proofErr w:type="spellStart"/>
+      <w:r>
+        <w:t>name</w:t>
+      </w:r>
+      <w:proofErr w:type="spellEnd"/>
+      <w:r>
+        <w:t xml:space="preserve"> </w:t>
+      </w:r>
+      <w:proofErr w:type="spellStart"/>
+      <w:r>
+        <w:t>that</w:t>
+      </w:r>
+      <w:proofErr w:type="spellEnd"/>
+      <w:r>
+        <w:t xml:space="preserve"> </w:t>
+      </w:r>
+      <w:proofErr w:type="spellStart"/>
+      <w:r>
+        <w:t>includes</w:t>
+      </w:r>
+      <w:proofErr w:type="spellEnd"/>
+      <w:r>
+        <w:t xml:space="preserve"> </w:t>
+      </w:r>
+      <w:proofErr w:type="spellStart"/>
+      <w:r>
+        <w:t>the</w:t>
+      </w:r>
+      <w:proofErr w:type="spellEnd"/>
+      <w:r>
+        <w:t xml:space="preserve"> </w:t>
+      </w:r>
+      <w:proofErr w:type="spellStart"/>
+      <w:r>
+        <w:t>size</w:t>
+      </w:r>
+      <w:proofErr w:type="spellEnd"/>
+      <w:r>
+        <w:t xml:space="preserve"> </w:t>
+      </w:r>
+      <w:proofErr w:type="spellStart"/>
+      <w:r>
+        <w:t>of</w:t>
+      </w:r>
+      <w:proofErr w:type="spellEnd"/>
+      <w:r>
+        <w:t xml:space="preserve"> </w:t>
+      </w:r>
+      <w:proofErr w:type="spellStart"/>
+      <w:r>
+        <w:t>the</w:t>
+      </w:r>
+      <w:proofErr w:type="spellEnd"/>
+      <w:r>
+        <w:t xml:space="preserve"> </w:t>
+      </w:r>
+      <w:proofErr w:type="spellStart"/>
+      <w:r>
+        <w:t>bus</w:t>
+      </w:r>
+      <w:proofErr w:type="spellEnd"/>
+      <w:r>
+        <w:t>:</w:t>
       </w:r>
     </w:p>
     <w:p>
       <w:r>
+        <w:rPr>
+          <w:noProof/>
+        </w:rPr>
         <w:drawing>
           <wp:inline distT="0" distB="0" distL="0" distR="0" wp14:anchorId="2A1FF3FA" wp14:editId="26DF872D">
             <wp:extent cx="5757905" cy="3248049"/>
@@ -209,10 +387,405 @@
       </w:r>
     </w:p>
     <w:p>
-      <w:r>
-        <w:t>Then the bus line is automatically drawn larger. This indicates you did correctly</w:t>
-      </w:r>
+      <w:proofErr w:type="spellStart"/>
+      <w:r>
+        <w:t>Then</w:t>
+      </w:r>
+      <w:proofErr w:type="spellEnd"/>
+      <w:r>
+        <w:t xml:space="preserve"> </w:t>
+      </w:r>
+      <w:proofErr w:type="spellStart"/>
+      <w:r>
+        <w:t>the</w:t>
+      </w:r>
+      <w:proofErr w:type="spellEnd"/>
+      <w:r>
+        <w:t xml:space="preserve"> </w:t>
+      </w:r>
+      <w:proofErr w:type="spellStart"/>
+      <w:r>
+        <w:t>bus</w:t>
+      </w:r>
+      <w:proofErr w:type="spellEnd"/>
+      <w:r>
+        <w:t xml:space="preserve"> </w:t>
+      </w:r>
+      <w:proofErr w:type="spellStart"/>
+      <w:r>
+        <w:t>line</w:t>
+      </w:r>
+      <w:proofErr w:type="spellEnd"/>
+      <w:r>
+        <w:t xml:space="preserve"> </w:t>
+      </w:r>
+      <w:proofErr w:type="spellStart"/>
+      <w:r>
+        <w:t>is</w:t>
+      </w:r>
+      <w:proofErr w:type="spellEnd"/>
+      <w:r>
+        <w:t xml:space="preserve"> </w:t>
+      </w:r>
+      <w:proofErr w:type="spellStart"/>
+      <w:r>
+        <w:t>automatically</w:t>
+      </w:r>
+      <w:proofErr w:type="spellEnd"/>
+      <w:r>
+        <w:t xml:space="preserve"> </w:t>
+      </w:r>
+      <w:proofErr w:type="spellStart"/>
+      <w:r>
+        <w:t>drawn</w:t>
+      </w:r>
+      <w:proofErr w:type="spellEnd"/>
+      <w:r>
+        <w:t xml:space="preserve"> larger. This </w:t>
+      </w:r>
+      <w:proofErr w:type="spellStart"/>
+      <w:r>
+        <w:t>indicates</w:t>
+      </w:r>
+      <w:proofErr w:type="spellEnd"/>
+      <w:r>
+        <w:t xml:space="preserve"> </w:t>
+      </w:r>
+      <w:proofErr w:type="spellStart"/>
+      <w:r>
+        <w:t>you</w:t>
+      </w:r>
+      <w:proofErr w:type="spellEnd"/>
+      <w:r>
+        <w:t xml:space="preserve"> </w:t>
+      </w:r>
+      <w:proofErr w:type="spellStart"/>
+      <w:r>
+        <w:t>did</w:t>
+      </w:r>
+      <w:proofErr w:type="spellEnd"/>
+      <w:r>
+        <w:t xml:space="preserve"> </w:t>
+      </w:r>
+      <w:proofErr w:type="spellStart"/>
+      <w:r>
+        <w:t>correctly</w:t>
+      </w:r>
+      <w:proofErr w:type="spellEnd"/>
     </w:p>
+    <w:p/>
+    <w:p/>
+    <w:p/>
+    <w:p/>
+    <w:p/>
+    <w:p/>
+    <w:p/>
+    <w:p/>
+    <w:p/>
+    <w:p>
+      <w:r>
+        <w:lastRenderedPageBreak/>
+        <w:t xml:space="preserve">7-segment LED </w:t>
+      </w:r>
+      <w:proofErr w:type="spellStart"/>
+      <w:r>
+        <w:t>display</w:t>
+      </w:r>
+      <w:proofErr w:type="spellEnd"/>
+    </w:p>
+    <w:p>
+      <w:r>
+        <w:drawing>
+          <wp:inline distT="0" distB="0" distL="0" distR="0" wp14:anchorId="10BCE92C" wp14:editId="3A49F8C7">
+            <wp:extent cx="1619262" cy="1543061"/>
+            <wp:effectExtent l="0" t="0" r="0" b="0"/>
+            <wp:docPr id="5" name="Grafik 5"/>
+            <wp:cNvGraphicFramePr>
+              <a:graphicFrameLocks xmlns:a="http://schemas.openxmlformats.org/drawingml/2006/main" noChangeAspect="1"/>
+            </wp:cNvGraphicFramePr>
+            <a:graphic xmlns:a="http://schemas.openxmlformats.org/drawingml/2006/main">
+              <a:graphicData uri="http://schemas.openxmlformats.org/drawingml/2006/picture">
+                <pic:pic xmlns:pic="http://schemas.openxmlformats.org/drawingml/2006/picture">
+                  <pic:nvPicPr>
+                    <pic:cNvPr id="1" name=""/>
+                    <pic:cNvPicPr/>
+                  </pic:nvPicPr>
+                  <pic:blipFill>
+                    <a:blip r:embed="rId8"/>
+                    <a:stretch>
+                      <a:fillRect/>
+                    </a:stretch>
+                  </pic:blipFill>
+                  <pic:spPr>
+                    <a:xfrm>
+                      <a:off x="0" y="0"/>
+                      <a:ext cx="1619262" cy="1543061"/>
+                    </a:xfrm>
+                    <a:prstGeom prst="rect">
+                      <a:avLst/>
+                    </a:prstGeom>
+                  </pic:spPr>
+                </pic:pic>
+              </a:graphicData>
+            </a:graphic>
+          </wp:inline>
+        </w:drawing>
+      </w:r>
+    </w:p>
+    <w:tbl>
+      <w:tblPr>
+        <w:tblStyle w:val="Tabellenraster"/>
+        <w:tblW w:w="0" w:type="auto"/>
+        <w:tblLook w:val="04A0" w:firstRow="1" w:lastRow="0" w:firstColumn="1" w:lastColumn="0" w:noHBand="0" w:noVBand="1"/>
+      </w:tblPr>
+      <w:tblGrid>
+        <w:gridCol w:w="558"/>
+        <w:gridCol w:w="859"/>
+      </w:tblGrid>
+      <w:tr>
+        <w:tc>
+          <w:tcPr>
+            <w:tcW w:w="0" w:type="auto"/>
+          </w:tcPr>
+          <w:p>
+            <w:r>
+              <w:t>Hex</w:t>
+            </w:r>
+          </w:p>
+        </w:tc>
+        <w:tc>
+          <w:tcPr>
+            <w:tcW w:w="0" w:type="auto"/>
+          </w:tcPr>
+          <w:p>
+            <w:r>
+              <w:t>Display</w:t>
+            </w:r>
+          </w:p>
+        </w:tc>
+      </w:tr>
+      <w:tr>
+        <w:tc>
+          <w:tcPr>
+            <w:tcW w:w="0" w:type="auto"/>
+          </w:tcPr>
+          <w:p>
+            <w:r>
+              <w:t>06</w:t>
+            </w:r>
+          </w:p>
+        </w:tc>
+        <w:tc>
+          <w:tcPr>
+            <w:tcW w:w="0" w:type="auto"/>
+          </w:tcPr>
+          <w:p>
+            <w:r>
+              <w:t>1</w:t>
+            </w:r>
+          </w:p>
+        </w:tc>
+      </w:tr>
+      <w:tr>
+        <w:tc>
+          <w:tcPr>
+            <w:tcW w:w="0" w:type="auto"/>
+          </w:tcPr>
+          <w:p>
+            <w:r>
+              <w:t>5B</w:t>
+            </w:r>
+          </w:p>
+        </w:tc>
+        <w:tc>
+          <w:tcPr>
+            <w:tcW w:w="0" w:type="auto"/>
+          </w:tcPr>
+          <w:p>
+            <w:r>
+              <w:t>2</w:t>
+            </w:r>
+          </w:p>
+        </w:tc>
+      </w:tr>
+      <w:tr>
+        <w:tc>
+          <w:tcPr>
+            <w:tcW w:w="0" w:type="auto"/>
+          </w:tcPr>
+          <w:p>
+            <w:r>
+              <w:t>4F</w:t>
+            </w:r>
+          </w:p>
+        </w:tc>
+        <w:tc>
+          <w:tcPr>
+            <w:tcW w:w="0" w:type="auto"/>
+          </w:tcPr>
+          <w:p>
+            <w:r>
+              <w:t>3</w:t>
+            </w:r>
+          </w:p>
+        </w:tc>
+      </w:tr>
+      <w:tr>
+        <w:tc>
+          <w:tcPr>
+            <w:tcW w:w="0" w:type="auto"/>
+          </w:tcPr>
+          <w:p>
+            <w:r>
+              <w:t>66</w:t>
+            </w:r>
+          </w:p>
+        </w:tc>
+        <w:tc>
+          <w:tcPr>
+            <w:tcW w:w="0" w:type="auto"/>
+          </w:tcPr>
+          <w:p>
+            <w:r>
+              <w:t>4</w:t>
+            </w:r>
+          </w:p>
+        </w:tc>
+      </w:tr>
+      <w:tr>
+        <w:tc>
+          <w:tcPr>
+            <w:tcW w:w="0" w:type="auto"/>
+          </w:tcPr>
+          <w:p>
+            <w:r>
+              <w:t>6D</w:t>
+            </w:r>
+          </w:p>
+        </w:tc>
+        <w:tc>
+          <w:tcPr>
+            <w:tcW w:w="0" w:type="auto"/>
+          </w:tcPr>
+          <w:p>
+            <w:r>
+              <w:t>5</w:t>
+            </w:r>
+          </w:p>
+        </w:tc>
+      </w:tr>
+      <w:tr>
+        <w:tc>
+          <w:tcPr>
+            <w:tcW w:w="0" w:type="auto"/>
+          </w:tcPr>
+          <w:p>
+            <w:r>
+              <w:t>7D</w:t>
+            </w:r>
+          </w:p>
+        </w:tc>
+        <w:tc>
+          <w:tcPr>
+            <w:tcW w:w="0" w:type="auto"/>
+          </w:tcPr>
+          <w:p>
+            <w:r>
+              <w:t>6</w:t>
+            </w:r>
+          </w:p>
+        </w:tc>
+      </w:tr>
+      <w:tr>
+        <w:tc>
+          <w:tcPr>
+            <w:tcW w:w="0" w:type="auto"/>
+          </w:tcPr>
+          <w:p>
+            <w:r>
+              <w:t>07</w:t>
+            </w:r>
+          </w:p>
+        </w:tc>
+        <w:tc>
+          <w:tcPr>
+            <w:tcW w:w="0" w:type="auto"/>
+          </w:tcPr>
+          <w:p>
+            <w:r>
+              <w:t>7</w:t>
+            </w:r>
+          </w:p>
+        </w:tc>
+      </w:tr>
+      <w:tr>
+        <w:tc>
+          <w:tcPr>
+            <w:tcW w:w="0" w:type="auto"/>
+          </w:tcPr>
+          <w:p>
+            <w:r>
+              <w:t>7F</w:t>
+            </w:r>
+          </w:p>
+        </w:tc>
+        <w:tc>
+          <w:tcPr>
+            <w:tcW w:w="0" w:type="auto"/>
+          </w:tcPr>
+          <w:p>
+            <w:r>
+              <w:t>8</w:t>
+            </w:r>
+          </w:p>
+        </w:tc>
+      </w:tr>
+      <w:tr>
+        <w:tc>
+          <w:tcPr>
+            <w:tcW w:w="0" w:type="auto"/>
+          </w:tcPr>
+          <w:p>
+            <w:r>
+              <w:t>6F</w:t>
+            </w:r>
+          </w:p>
+        </w:tc>
+        <w:tc>
+          <w:tcPr>
+            <w:tcW w:w="0" w:type="auto"/>
+          </w:tcPr>
+          <w:p>
+            <w:r>
+              <w:t>9</w:t>
+            </w:r>
+          </w:p>
+        </w:tc>
+      </w:tr>
+      <w:tr>
+        <w:tc>
+          <w:tcPr>
+            <w:tcW w:w="0" w:type="auto"/>
+          </w:tcPr>
+          <w:p>
+            <w:r>
+              <w:t>3F</w:t>
+            </w:r>
+          </w:p>
+        </w:tc>
+        <w:tc>
+          <w:tcPr>
+            <w:tcW w:w="0" w:type="auto"/>
+          </w:tcPr>
+          <w:p>
+            <w:r>
+              <w:t>0</w:t>
+            </w:r>
+          </w:p>
+        </w:tc>
+      </w:tr>
+    </w:tbl>
+    <w:p/>
     <w:sectPr>
       <w:pgSz w:w="11906" w:h="16838"/>
       <w:pgMar w:top="1417" w:right="1417" w:bottom="1134" w:left="1417" w:header="708" w:footer="708" w:gutter="0"/>
@@ -649,6 +1222,25 @@
     <w:semiHidden/>
     <w:unhideWhenUsed/>
   </w:style>
+  <w:style w:type="table" w:styleId="Tabellenraster">
+    <w:name w:val="Table Grid"/>
+    <w:basedOn w:val="NormaleTabelle"/>
+    <w:uiPriority w:val="39"/>
+    <w:rsid w:val="00D21EDE"/>
+    <w:pPr>
+      <w:spacing w:after="0" w:line="240" w:lineRule="auto"/>
+    </w:pPr>
+    <w:tblPr>
+      <w:tblBorders>
+        <w:top w:val="single" w:sz="4" w:space="0" w:color="auto"/>
+        <w:left w:val="single" w:sz="4" w:space="0" w:color="auto"/>
+        <w:bottom w:val="single" w:sz="4" w:space="0" w:color="auto"/>
+        <w:right w:val="single" w:sz="4" w:space="0" w:color="auto"/>
+        <w:insideH w:val="single" w:sz="4" w:space="0" w:color="auto"/>
+        <w:insideV w:val="single" w:sz="4" w:space="0" w:color="auto"/>
+      </w:tblBorders>
+    </w:tblPr>
+  </w:style>
 </w:styles>
 </file>
 

</xml_diff>

<commit_message>
added all 30 FPGA and 30 Adapter Board pins to the project. Each can be selected as input or output and each pin has a pin enable control signal. all is controlled via i2c registers
</commit_message>
<xml_diff>
--- a/EvalBoard/Notes/Eval Board Lattice LC4256ZE.docx
+++ b/EvalBoard/Notes/Eval Board Lattice LC4256ZE.docx
@@ -495,6 +495,9 @@
     </w:p>
     <w:p>
       <w:r>
+        <w:rPr>
+          <w:noProof/>
+        </w:rPr>
         <w:drawing>
           <wp:inline distT="0" distB="0" distL="0" distR="0" wp14:anchorId="10BCE92C" wp14:editId="3A49F8C7">
             <wp:extent cx="1619262" cy="1543061"/>
@@ -786,6 +789,81 @@
       </w:tr>
     </w:tbl>
     <w:p/>
+    <w:p/>
+    <w:p>
+      <w:pPr>
+        <w:rPr>
+          <w:b/>
+        </w:rPr>
+      </w:pPr>
+      <w:r>
+        <w:rPr>
+          <w:b/>
+        </w:rPr>
+        <w:t xml:space="preserve">ISP Lever </w:t>
+      </w:r>
+      <w:proofErr w:type="spellStart"/>
+      <w:r>
+        <w:rPr>
+          <w:b/>
+        </w:rPr>
+        <w:t>Incrementing</w:t>
+      </w:r>
+      <w:proofErr w:type="spellEnd"/>
+      <w:r>
+        <w:rPr>
+          <w:b/>
+        </w:rPr>
+        <w:t xml:space="preserve"> Net </w:t>
+      </w:r>
+      <w:proofErr w:type="spellStart"/>
+      <w:r>
+        <w:rPr>
+          <w:b/>
+        </w:rPr>
+        <w:t>Names</w:t>
+      </w:r>
+      <w:proofErr w:type="spellEnd"/>
+    </w:p>
+    <w:p>
+      <w:r>
+        <w:drawing>
+          <wp:inline distT="0" distB="0" distL="0" distR="0" wp14:anchorId="2CFF9B08" wp14:editId="64EB3BF9">
+            <wp:extent cx="3252811" cy="2495568"/>
+            <wp:effectExtent l="0" t="0" r="5080" b="0"/>
+            <wp:docPr id="6" name="Grafik 6" descr="Ein Bild, das Text enthält.&#10;&#10;Automatisch generierte Beschreibung"/>
+            <wp:cNvGraphicFramePr>
+              <a:graphicFrameLocks xmlns:a="http://schemas.openxmlformats.org/drawingml/2006/main" noChangeAspect="1"/>
+            </wp:cNvGraphicFramePr>
+            <a:graphic xmlns:a="http://schemas.openxmlformats.org/drawingml/2006/main">
+              <a:graphicData uri="http://schemas.openxmlformats.org/drawingml/2006/picture">
+                <pic:pic xmlns:pic="http://schemas.openxmlformats.org/drawingml/2006/picture">
+                  <pic:nvPicPr>
+                    <pic:cNvPr id="6" name="Grafik 6" descr="Ein Bild, das Text enthält.&#10;&#10;Automatisch generierte Beschreibung"/>
+                    <pic:cNvPicPr/>
+                  </pic:nvPicPr>
+                  <pic:blipFill>
+                    <a:blip r:embed="rId9"/>
+                    <a:stretch>
+                      <a:fillRect/>
+                    </a:stretch>
+                  </pic:blipFill>
+                  <pic:spPr>
+                    <a:xfrm>
+                      <a:off x="0" y="0"/>
+                      <a:ext cx="3252811" cy="2495568"/>
+                    </a:xfrm>
+                    <a:prstGeom prst="rect">
+                      <a:avLst/>
+                    </a:prstGeom>
+                  </pic:spPr>
+                </pic:pic>
+              </a:graphicData>
+            </a:graphic>
+          </wp:inline>
+        </w:drawing>
+      </w:r>
+    </w:p>
     <w:sectPr>
       <w:pgSz w:w="11906" w:h="16838"/>
       <w:pgMar w:top="1417" w:right="1417" w:bottom="1134" w:left="1417" w:header="708" w:footer="708" w:gutter="0"/>

</xml_diff>

<commit_message>
Status: can write to and read from registers in the CPLD but when reading, always the MSB is dropped (is always 0). No clue why!
</commit_message>
<xml_diff>
--- a/EvalBoard/Notes/Eval Board Lattice LC4256ZE.docx
+++ b/EvalBoard/Notes/Eval Board Lattice LC4256ZE.docx
@@ -827,6 +827,9 @@
     </w:p>
     <w:p>
       <w:r>
+        <w:rPr>
+          <w:noProof/>
+        </w:rPr>
         <w:drawing>
           <wp:inline distT="0" distB="0" distL="0" distR="0" wp14:anchorId="2CFF9B08" wp14:editId="64EB3BF9">
             <wp:extent cx="3252811" cy="2495568"/>
@@ -852,6 +855,79 @@
                     <a:xfrm>
                       <a:off x="0" y="0"/>
                       <a:ext cx="3252811" cy="2495568"/>
+                    </a:xfrm>
+                    <a:prstGeom prst="rect">
+                      <a:avLst/>
+                    </a:prstGeom>
+                  </pic:spPr>
+                </pic:pic>
+              </a:graphicData>
+            </a:graphic>
+          </wp:inline>
+        </w:drawing>
+      </w:r>
+    </w:p>
+    <w:p/>
+    <w:p/>
+    <w:p/>
+    <w:p/>
+    <w:p/>
+    <w:p/>
+    <w:p>
+      <w:pPr>
+        <w:rPr>
+          <w:b/>
+        </w:rPr>
+      </w:pPr>
+      <w:r>
+        <w:rPr>
+          <w:b/>
+        </w:rPr>
+        <w:lastRenderedPageBreak/>
+        <w:t xml:space="preserve">I2C Read </w:t>
+      </w:r>
+      <w:proofErr w:type="spellStart"/>
+      <w:r>
+        <w:rPr>
+          <w:b/>
+        </w:rPr>
+        <w:t>Issue</w:t>
+      </w:r>
+      <w:proofErr w:type="spellEnd"/>
+      <w:r>
+        <w:rPr>
+          <w:b/>
+        </w:rPr>
+        <w:t>:</w:t>
+      </w:r>
+    </w:p>
+    <w:p>
+      <w:r>
+        <w:drawing>
+          <wp:inline distT="0" distB="0" distL="0" distR="0" wp14:anchorId="7D6C1405" wp14:editId="749392F3">
+            <wp:extent cx="5760720" cy="4504690"/>
+            <wp:effectExtent l="0" t="0" r="0" b="0"/>
+            <wp:docPr id="7" name="Grafik 7"/>
+            <wp:cNvGraphicFramePr>
+              <a:graphicFrameLocks xmlns:a="http://schemas.openxmlformats.org/drawingml/2006/main" noChangeAspect="1"/>
+            </wp:cNvGraphicFramePr>
+            <a:graphic xmlns:a="http://schemas.openxmlformats.org/drawingml/2006/main">
+              <a:graphicData uri="http://schemas.openxmlformats.org/drawingml/2006/picture">
+                <pic:pic xmlns:pic="http://schemas.openxmlformats.org/drawingml/2006/picture">
+                  <pic:nvPicPr>
+                    <pic:cNvPr id="1" name=""/>
+                    <pic:cNvPicPr/>
+                  </pic:nvPicPr>
+                  <pic:blipFill>
+                    <a:blip r:embed="rId10"/>
+                    <a:stretch>
+                      <a:fillRect/>
+                    </a:stretch>
+                  </pic:blipFill>
+                  <pic:spPr>
+                    <a:xfrm>
+                      <a:off x="0" y="0"/>
+                      <a:ext cx="5760720" cy="4504690"/>
                     </a:xfrm>
                     <a:prstGeom prst="rect">
                       <a:avLst/>

</xml_diff>